<commit_message>
feat(agent,cli): implement agent protocol with NDJSON streaming and error handling
- Add agent envelope types with schema versioning and diagnostic support
- Implement output limits tracking with continuation tokens for paginated results
- Add error envelope and error record types for structured error reporting
- Implement continuation token encoding/decoding for resuming long-running queries
- Add query limits struct and text truncation utilities for output control
- Add JSON field projection and string truncation for limiting response payloads
- Implement NDJSON event writer for streaming agent protocol responses
- Add comprehensive agent protocol CLI tests validating envelope serialization
- Define JSON schemas for agent envelope, diagnostic records, and NDJSON events
- Move serde_json to main dependencies for serialization in agent crate
- Update sample fixtures to support agent protocol validation testing
</commit_message>
<xml_diff>
--- a/fixtures/validation/sample_features.docx
+++ b/fixtures/validation/sample_features.docx
@@ -1,6 +1,6 @@
 
 <file path=word/document.xml><?xml version="1.0" encoding="utf-8"?>
-<w:document xmlns:w="http://schemas.openxmlformats.org/wordprocessingml/2006/main" xmlns:r="http://schemas.openxmlformats.org/officeDocument/2006/relationships" xmlns:wp="http://schemas.openxmlformats.org/drawingml/2006/wordprocessingDrawing" xmlns:a="http://schemas.openxmlformats.org/drawingml/2006/main">
+<w:document xmlns:w="http://schemas.openxmlformats.org/wordprocessingml/2006/main" xmlns:r="http://schemas.openxmlformats.org/officeDocument/2006/relationships" xmlns:wp="http://schemas.openxmlformats.org/drawingml/2006/wordprocessingDrawing" xmlns:a="http://schemas.openxmlformats.org/drawingml/2006/main" xmlns:pic="http://schemas.openxmlformats.org/drawingml/2006/picture">
   <w:body>
     <w:p>
       <w:pPr>
@@ -37,8 +37,28 @@
             <wp:extent cx="2540000" cy="1270000"/>
             <wp:docPr id="1" name="Diagram 1" descr="System Architecture Diagram"/>
             <a:graphic>
-              <a:graphicData>
-                <a:blip r:embed="rIdImg"/>
+              <a:graphicData uri="http://schemas.openxmlformats.org/drawingml/2006/picture">
+                <pic:pic>
+                  <pic:nvPicPr>
+                    <pic:cNvPr id="0" name="Picture"/>
+                    <pic:cNvPicPr/>
+                  </pic:nvPicPr>
+                  <pic:blipFill>
+                    <a:blip r:embed="rIdImg"/>
+                    <a:stretch>
+                      <a:fillRect/>
+                    </a:stretch>
+                  </pic:blipFill>
+                  <pic:spPr>
+                    <a:xfrm>
+                      <a:off x="0" y="0"/>
+                      <a:ext cx="2540000" cy="1270000"/>
+                    </a:xfrm>
+                    <a:prstGeom prst="rect">
+                      <a:avLst/>
+                    </a:prstGeom>
+                  </pic:spPr>
+                </pic:pic>
               </a:graphicData>
             </a:graphic>
           </wp:inline>
@@ -129,4 +149,15 @@
     </w:r>
   </w:p>
 </w:hdr>
+</file>
+
+<file path=word/styles.xml><?xml version="1.0" encoding="utf-8"?>
+<w:styles xmlns:w="http://schemas.openxmlformats.org/wordprocessingml/2006/main">
+  <w:style w:type="paragraph" w:default="1" w:styleId="Normal">
+    <w:name w:val="Normal"/>
+  </w:style>
+  <w:style w:type="paragraph" w:styleId="Heading1">
+    <w:name w:val="heading 1"/>
+  </w:style>
+</w:styles>
 </file>
</xml_diff>